<commit_message>
Update MN-MATCH process document with content corrections
- Removed co-mentor and SME assignment (happens in MN-ENGAGE, not here)
- Removed Meeting Cadence (set during first engagement, not at assignment)
- Fixed Section 5 intro: Mentor Contact fields from MR or MN-INTAKE
- Workflow reduced from 12 to 11 steps
- REQ-003 simplified to primary mentor only
- Data Collected reduced from 6 to 3 fields (DAT-019 through DAT-021)
- Total DAT identifiers: 21 (was 24)
</commit_message>
<xml_diff>
--- a/PRDs/MN/MN-MATCH.docx
+++ b/PRDs/MN/MN-MATCH.docx
@@ -519,7 +519,7 @@
           <w:sz w:val="22"/>
           <w:szCs w:val="22"/>
         </w:rPr>
-        <w:t xml:space="preserve">The process is complete when a mentor has accepted the assignment, set the meeting cadence, and personally introduced themselves to the client. If a mentor declines, the process cycles back to candidate selection until a mentor accepts.</w:t>
+        <w:t xml:space="preserve">The process is complete when a mentor has accepted the assignment and personally introduced themselves to the client. If a mentor declines, the process cycles back to candidate selection until a mentor accepts.</w:t>
       </w:r>
     </w:p>
     <w:p>
@@ -571,7 +571,7 @@
           <w:sz w:val="22"/>
           <w:szCs w:val="22"/>
         </w:rPr>
-        <w:t xml:space="preserve">Searches the mentor roster, evaluates candidates against client needs, nominates the primary mentor and optional co-mentors or subject matter experts, and activates the assignment upon acceptance.</w:t>
+        <w:t xml:space="preserve">Searches the mentor roster, evaluates candidates against client needs, nominates the primary mentor, and activates the assignment upon acceptance.</w:t>
       </w:r>
     </w:p>
     <w:p>
@@ -639,7 +639,7 @@
           <w:sz w:val="22"/>
           <w:szCs w:val="22"/>
         </w:rPr>
-        <w:t xml:space="preserve">Receives the assignment notification, reviews the client summary, and accepts or declines the assignment. Upon acceptance, sets the meeting cadence and personally introduces themselves to the client.</w:t>
+        <w:t xml:space="preserve">Receives the assignment notification, reviews the client summary, and accepts or declines the assignment. Upon acceptance, personally introduces themselves to the client.</w:t>
       </w:r>
     </w:p>
     <w:p>
@@ -723,7 +723,7 @@
           <w:sz w:val="22"/>
           <w:szCs w:val="22"/>
         </w:rPr>
-        <w:t xml:space="preserve">The Client Assignment Coordinator selects a primary mentor and optionally one or more co-mentors or subject matter experts.</w:t>
+        <w:t xml:space="preserve">The Client Assignment Coordinator selects a primary mentor for the engagement.</w:t>
       </w:r>
     </w:p>
     <w:p>
@@ -745,7 +745,7 @@
           <w:sz w:val="22"/>
           <w:szCs w:val="22"/>
         </w:rPr>
-        <w:t xml:space="preserve">The system verifies each nominated mentor is Active, currently accepting new clients, and has available capacity before the nomination is confirmed.</w:t>
+        <w:t xml:space="preserve">The system verifies the nominated mentor is Active, currently accepting new clients, and has available capacity before the nomination is confirmed.</w:t>
       </w:r>
     </w:p>
     <w:p>
@@ -877,28 +877,6 @@
           <w:sz w:val="22"/>
           <w:szCs w:val="22"/>
         </w:rPr>
-        <w:t xml:space="preserve">Upon acceptance, the mentor sets the Meeting Cadence on the Engagement record.</w:t>
-      </w:r>
-    </w:p>
-    <w:p>
-      <w:pPr>
-        <w:pStyle w:val="ListParagraph"/>
-        <w:numPr>
-          <w:ilvl w:val="0"/>
-          <w:numId w:val="2"/>
-        </w:numPr>
-        <w:spacing w:after="80"/>
-      </w:pPr>
-      <w:r>
-        <w:rPr>
-          <w:rFonts w:ascii="Arial" w:cs="Arial" w:eastAsia="Arial" w:hAnsi="Arial"/>
-          <w:b w:val="false"/>
-          <w:bCs w:val="false"/>
-          <w:i w:val="false"/>
-          <w:iCs w:val="false"/>
-          <w:sz w:val="22"/>
-          <w:szCs w:val="22"/>
-        </w:rPr>
         <w:t xml:space="preserve">The mentor personally introduces themselves to the client via email. The system provides email templates as a starting point. The introduction is sent by the mentor — not auto-generated by the system.</w:t>
       </w:r>
     </w:p>
@@ -1302,7 +1280,7 @@
                 <w:sz w:val="20"/>
                 <w:szCs w:val="20"/>
               </w:rPr>
-              <w:t xml:space="preserve">The system must support assignment of a primary mentor and optionally one or more co-mentors and subject matter experts per engagement.</w:t>
+              <w:t xml:space="preserve">The system must support assignment of a primary mentor to an engagement.</w:t>
             </w:r>
           </w:p>
         </w:tc>
@@ -1666,7 +1644,7 @@
           <w:sz w:val="22"/>
           <w:szCs w:val="22"/>
         </w:rPr>
-        <w:t xml:space="preserve">The following fields must already exist for the Mentor Matching process to function. Client Organization and Engagement fields are established by the Client Intake process (MN-INTAKE). Mentor Contact fields are established by the Mentor Recruitment domain (MR).</w:t>
+        <w:t xml:space="preserve">The following fields must already exist for the Mentor Matching process to function. Client Organization and Engagement fields are established by the Client Intake process (MN-INTAKE). Mentor Contact fields are established by the Mentor Recruitment domain (MR) or the Client Intake process (MN-INTAKE).</w:t>
       </w:r>
     </w:p>
     <w:p>
@@ -4481,7 +4459,7 @@
           <w:sz w:val="22"/>
           <w:szCs w:val="22"/>
         </w:rPr>
-        <w:t xml:space="preserve">The following fields are defined by the Mentor Recruitment domain (MR) and referenced here for matching purposes.</w:t>
+        <w:t xml:space="preserve">The following fields are defined by the Mentor Recruitment domain (MR) or the Client Intake process (MN-INTAKE) and referenced here for matching purposes.</w:t>
       </w:r>
     </w:p>
     <w:p>
@@ -7068,7 +7046,7 @@
                 <w:sz w:val="20"/>
                 <w:szCs w:val="20"/>
               </w:rPr>
-              <w:t xml:space="preserve">Co-Mentors</w:t>
+              <w:t xml:space="preserve">Status</w:t>
             </w:r>
           </w:p>
         </w:tc>
@@ -7100,7 +7078,7 @@
                 <w:sz w:val="20"/>
                 <w:szCs w:val="20"/>
               </w:rPr>
-              <w:t xml:space="preserve">Relationship (many)</w:t>
+              <w:t xml:space="preserve">Dropdown</w:t>
             </w:r>
           </w:p>
         </w:tc>
@@ -7132,7 +7110,7 @@
                 <w:sz w:val="20"/>
                 <w:szCs w:val="20"/>
               </w:rPr>
-              <w:t xml:space="preserve">No</w:t>
+              <w:t xml:space="preserve">Yes</w:t>
             </w:r>
           </w:p>
         </w:tc>
@@ -7164,7 +7142,7 @@
                 <w:sz w:val="20"/>
                 <w:szCs w:val="20"/>
               </w:rPr>
-              <w:t xml:space="preserve">—</w:t>
+              <w:t xml:space="preserve">Submitted, Declined, Pending Acceptance, Assigned, Active, On-Hold, Dormant, Inactive, Abandoned, Completed</w:t>
             </w:r>
           </w:p>
         </w:tc>
@@ -7265,7 +7243,7 @@
                 <w:sz w:val="20"/>
                 <w:szCs w:val="20"/>
               </w:rPr>
-              <w:t xml:space="preserve">One or more volunteer mentors assigned in a supporting co-mentor role alongside the primary mentor. Multiple co-mentors may be active simultaneously.</w:t>
+              <w:t xml:space="preserve">Updated by this process: transitions from Submitted to Pending Acceptance when a mentor is nominated, to Assigned when the mentor accepts, or back to Submitted if the mentor declines.</w:t>
             </w:r>
           </w:p>
         </w:tc>
@@ -7298,7 +7276,7 @@
                 <w:sz w:val="20"/>
                 <w:szCs w:val="20"/>
               </w:rPr>
-              <w:t xml:space="preserve">Subject Matter Experts</w:t>
+              <w:t xml:space="preserve">Engagement Contacts</w:t>
             </w:r>
           </w:p>
         </w:tc>
@@ -7470,692 +7448,6 @@
               <w:bottom w:val="single" w:color="AAAAAA" w:sz="1"/>
               <w:right w:val="single" w:color="AAAAAA" w:sz="1"/>
             </w:tcBorders>
-            <w:tcMar>
-              <w:top w:type="dxa" w:w="40"/>
-              <w:left w:type="dxa" w:w="100"/>
-              <w:bottom w:type="dxa" w:w="80"/>
-              <w:right w:type="dxa" w:w="100"/>
-            </w:tcMar>
-          </w:tcPr>
-          <w:p>
-            <w:r>
-              <w:rPr>
-                <w:rFonts w:ascii="Arial" w:cs="Arial" w:eastAsia="Arial" w:hAnsi="Arial"/>
-                <w:b w:val="false"/>
-                <w:bCs w:val="false"/>
-                <w:i w:val="false"/>
-                <w:iCs w:val="false"/>
-                <w:color w:val="888888"/>
-                <w:sz w:val="20"/>
-                <w:szCs w:val="20"/>
-              </w:rPr>
-              <w:t xml:space="preserve">One or more volunteer mentors providing specialist expertise on request for specific topics within the engagement.</w:t>
-            </w:r>
-          </w:p>
-        </w:tc>
-      </w:tr>
-      <w:tr>
-        <w:tc>
-          <w:tcPr>
-            <w:tcW w:type="dxa" w:w="2200"/>
-            <w:tcBorders>
-              <w:top w:val="single" w:color="AAAAAA" w:sz="1"/>
-              <w:left w:val="single" w:color="AAAAAA" w:sz="1"/>
-              <w:bottom w:val="single" w:color="AAAAAA" w:sz="1"/>
-              <w:right w:val="single" w:color="AAAAAA" w:sz="1"/>
-            </w:tcBorders>
-            <w:shd w:fill="F2F7FB" w:val="clear"/>
-            <w:tcMar>
-              <w:top w:type="dxa" w:w="60"/>
-              <w:left w:type="dxa" w:w="100"/>
-              <w:bottom w:type="dxa" w:w="60"/>
-              <w:right w:type="dxa" w:w="100"/>
-            </w:tcMar>
-          </w:tcPr>
-          <w:p>
-            <w:r>
-              <w:rPr>
-                <w:rFonts w:ascii="Arial" w:cs="Arial" w:eastAsia="Arial" w:hAnsi="Arial"/>
-                <w:b/>
-                <w:bCs/>
-                <w:i w:val="false"/>
-                <w:iCs w:val="false"/>
-                <w:sz w:val="20"/>
-                <w:szCs w:val="20"/>
-              </w:rPr>
-              <w:t xml:space="preserve">Meeting Cadence</w:t>
-            </w:r>
-          </w:p>
-        </w:tc>
-        <w:tc>
-          <w:tcPr>
-            <w:tcW w:type="dxa" w:w="1100"/>
-            <w:tcBorders>
-              <w:top w:val="single" w:color="AAAAAA" w:sz="1"/>
-              <w:left w:val="single" w:color="AAAAAA" w:sz="1"/>
-              <w:bottom w:val="single" w:color="AAAAAA" w:sz="1"/>
-              <w:right w:val="single" w:color="AAAAAA" w:sz="1"/>
-            </w:tcBorders>
-            <w:shd w:fill="F2F7FB" w:val="clear"/>
-            <w:tcMar>
-              <w:top w:type="dxa" w:w="60"/>
-              <w:left w:type="dxa" w:w="100"/>
-              <w:bottom w:type="dxa" w:w="60"/>
-              <w:right w:type="dxa" w:w="100"/>
-            </w:tcMar>
-          </w:tcPr>
-          <w:p>
-            <w:r>
-              <w:rPr>
-                <w:rFonts w:ascii="Arial" w:cs="Arial" w:eastAsia="Arial" w:hAnsi="Arial"/>
-                <w:b w:val="false"/>
-                <w:bCs w:val="false"/>
-                <w:i w:val="false"/>
-                <w:iCs w:val="false"/>
-                <w:sz w:val="20"/>
-                <w:szCs w:val="20"/>
-              </w:rPr>
-              <w:t xml:space="preserve">Dropdown</w:t>
-            </w:r>
-          </w:p>
-        </w:tc>
-        <w:tc>
-          <w:tcPr>
-            <w:tcW w:type="dxa" w:w="800"/>
-            <w:tcBorders>
-              <w:top w:val="single" w:color="AAAAAA" w:sz="1"/>
-              <w:left w:val="single" w:color="AAAAAA" w:sz="1"/>
-              <w:bottom w:val="single" w:color="AAAAAA" w:sz="1"/>
-              <w:right w:val="single" w:color="AAAAAA" w:sz="1"/>
-            </w:tcBorders>
-            <w:shd w:fill="F2F7FB" w:val="clear"/>
-            <w:tcMar>
-              <w:top w:type="dxa" w:w="60"/>
-              <w:left w:type="dxa" w:w="100"/>
-              <w:bottom w:type="dxa" w:w="60"/>
-              <w:right w:type="dxa" w:w="100"/>
-            </w:tcMar>
-          </w:tcPr>
-          <w:p>
-            <w:r>
-              <w:rPr>
-                <w:rFonts w:ascii="Arial" w:cs="Arial" w:eastAsia="Arial" w:hAnsi="Arial"/>
-                <w:b w:val="false"/>
-                <w:bCs w:val="false"/>
-                <w:i w:val="false"/>
-                <w:iCs w:val="false"/>
-                <w:sz w:val="20"/>
-                <w:szCs w:val="20"/>
-              </w:rPr>
-              <w:t xml:space="preserve">Yes</w:t>
-            </w:r>
-          </w:p>
-        </w:tc>
-        <w:tc>
-          <w:tcPr>
-            <w:tcW w:type="dxa" w:w="2400"/>
-            <w:tcBorders>
-              <w:top w:val="single" w:color="AAAAAA" w:sz="1"/>
-              <w:left w:val="single" w:color="AAAAAA" w:sz="1"/>
-              <w:bottom w:val="single" w:color="AAAAAA" w:sz="1"/>
-              <w:right w:val="single" w:color="AAAAAA" w:sz="1"/>
-            </w:tcBorders>
-            <w:shd w:fill="F2F7FB" w:val="clear"/>
-            <w:tcMar>
-              <w:top w:type="dxa" w:w="60"/>
-              <w:left w:type="dxa" w:w="100"/>
-              <w:bottom w:type="dxa" w:w="60"/>
-              <w:right w:type="dxa" w:w="100"/>
-            </w:tcMar>
-          </w:tcPr>
-          <w:p>
-            <w:r>
-              <w:rPr>
-                <w:rFonts w:ascii="Arial" w:cs="Arial" w:eastAsia="Arial" w:hAnsi="Arial"/>
-                <w:b w:val="false"/>
-                <w:bCs w:val="false"/>
-                <w:i w:val="false"/>
-                <w:iCs w:val="false"/>
-                <w:sz w:val="20"/>
-                <w:szCs w:val="20"/>
-              </w:rPr>
-              <w:t xml:space="preserve">Weekly, Bi-Weekly, Monthly, As Needed</w:t>
-            </w:r>
-          </w:p>
-        </w:tc>
-        <w:tc>
-          <w:tcPr>
-            <w:tcW w:type="dxa" w:w="1000"/>
-            <w:tcBorders>
-              <w:top w:val="single" w:color="AAAAAA" w:sz="1"/>
-              <w:left w:val="single" w:color="AAAAAA" w:sz="1"/>
-              <w:bottom w:val="single" w:color="AAAAAA" w:sz="1"/>
-              <w:right w:val="single" w:color="AAAAAA" w:sz="1"/>
-            </w:tcBorders>
-            <w:shd w:fill="F2F7FB" w:val="clear"/>
-            <w:tcMar>
-              <w:top w:type="dxa" w:w="60"/>
-              <w:left w:type="dxa" w:w="100"/>
-              <w:bottom w:type="dxa" w:w="60"/>
-              <w:right w:type="dxa" w:w="100"/>
-            </w:tcMar>
-          </w:tcPr>
-          <w:p>
-            <w:r>
-              <w:rPr>
-                <w:rFonts w:ascii="Arial" w:cs="Arial" w:eastAsia="Arial" w:hAnsi="Arial"/>
-                <w:b w:val="false"/>
-                <w:bCs w:val="false"/>
-                <w:i w:val="false"/>
-                <w:iCs w:val="false"/>
-                <w:sz w:val="20"/>
-                <w:szCs w:val="20"/>
-              </w:rPr>
-              <w:t xml:space="preserve">—</w:t>
-            </w:r>
-          </w:p>
-        </w:tc>
-        <w:tc>
-          <w:tcPr>
-            <w:tcW w:type="dxa" w:w="1860"/>
-            <w:tcBorders>
-              <w:top w:val="single" w:color="AAAAAA" w:sz="1"/>
-              <w:left w:val="single" w:color="AAAAAA" w:sz="1"/>
-              <w:bottom w:val="single" w:color="AAAAAA" w:sz="1"/>
-              <w:right w:val="single" w:color="AAAAAA" w:sz="1"/>
-            </w:tcBorders>
-            <w:shd w:fill="F2F7FB" w:val="clear"/>
-            <w:tcMar>
-              <w:top w:type="dxa" w:w="60"/>
-              <w:left w:type="dxa" w:w="100"/>
-              <w:bottom w:type="dxa" w:w="60"/>
-              <w:right w:type="dxa" w:w="100"/>
-            </w:tcMar>
-          </w:tcPr>
-          <w:p>
-            <w:r>
-              <w:rPr>
-                <w:rFonts w:ascii="Arial" w:cs="Arial" w:eastAsia="Arial" w:hAnsi="Arial"/>
-                <w:b w:val="false"/>
-                <w:bCs w:val="false"/>
-                <w:i w:val="false"/>
-                <w:iCs w:val="false"/>
-                <w:color w:val="888888"/>
-                <w:sz w:val="16"/>
-                <w:szCs w:val="16"/>
-              </w:rPr>
-              <w:t xml:space="preserve">MN-MATCH-DAT-022</w:t>
-            </w:r>
-          </w:p>
-        </w:tc>
-      </w:tr>
-      <w:tr>
-        <w:tc>
-          <w:tcPr>
-            <w:tcW w:type="dxa" w:w="9360"/>
-            <w:gridSpan w:val="6"/>
-            <w:tcBorders>
-              <w:top w:val="single" w:color="AAAAAA" w:sz="1"/>
-              <w:left w:val="single" w:color="AAAAAA" w:sz="1"/>
-              <w:bottom w:val="single" w:color="AAAAAA" w:sz="1"/>
-              <w:right w:val="single" w:color="AAAAAA" w:sz="1"/>
-            </w:tcBorders>
-            <w:shd w:fill="F2F7FB" w:val="clear"/>
-            <w:tcMar>
-              <w:top w:type="dxa" w:w="40"/>
-              <w:left w:type="dxa" w:w="100"/>
-              <w:bottom w:type="dxa" w:w="80"/>
-              <w:right w:type="dxa" w:w="100"/>
-            </w:tcMar>
-          </w:tcPr>
-          <w:p>
-            <w:r>
-              <w:rPr>
-                <w:rFonts w:ascii="Arial" w:cs="Arial" w:eastAsia="Arial" w:hAnsi="Arial"/>
-                <w:b w:val="false"/>
-                <w:bCs w:val="false"/>
-                <w:i w:val="false"/>
-                <w:iCs w:val="false"/>
-                <w:color w:val="888888"/>
-                <w:sz w:val="20"/>
-                <w:szCs w:val="20"/>
-              </w:rPr>
-              <w:t xml:space="preserve">The expected frequency of mentor-client meetings. Set by the mentor upon acceptance. Drives the cadence-aware inactivity monitoring thresholds for this engagement.</w:t>
-            </w:r>
-          </w:p>
-        </w:tc>
-      </w:tr>
-      <w:tr>
-        <w:tc>
-          <w:tcPr>
-            <w:tcW w:type="dxa" w:w="2200"/>
-            <w:tcBorders>
-              <w:top w:val="single" w:color="AAAAAA" w:sz="1"/>
-              <w:left w:val="single" w:color="AAAAAA" w:sz="1"/>
-              <w:bottom w:val="single" w:color="AAAAAA" w:sz="1"/>
-              <w:right w:val="single" w:color="AAAAAA" w:sz="1"/>
-            </w:tcBorders>
-            <w:tcMar>
-              <w:top w:type="dxa" w:w="60"/>
-              <w:left w:type="dxa" w:w="100"/>
-              <w:bottom w:type="dxa" w:w="60"/>
-              <w:right w:type="dxa" w:w="100"/>
-            </w:tcMar>
-          </w:tcPr>
-          <w:p>
-            <w:r>
-              <w:rPr>
-                <w:rFonts w:ascii="Arial" w:cs="Arial" w:eastAsia="Arial" w:hAnsi="Arial"/>
-                <w:b/>
-                <w:bCs/>
-                <w:i w:val="false"/>
-                <w:iCs w:val="false"/>
-                <w:sz w:val="20"/>
-                <w:szCs w:val="20"/>
-              </w:rPr>
-              <w:t xml:space="preserve">Status</w:t>
-            </w:r>
-          </w:p>
-        </w:tc>
-        <w:tc>
-          <w:tcPr>
-            <w:tcW w:type="dxa" w:w="1100"/>
-            <w:tcBorders>
-              <w:top w:val="single" w:color="AAAAAA" w:sz="1"/>
-              <w:left w:val="single" w:color="AAAAAA" w:sz="1"/>
-              <w:bottom w:val="single" w:color="AAAAAA" w:sz="1"/>
-              <w:right w:val="single" w:color="AAAAAA" w:sz="1"/>
-            </w:tcBorders>
-            <w:tcMar>
-              <w:top w:type="dxa" w:w="60"/>
-              <w:left w:type="dxa" w:w="100"/>
-              <w:bottom w:type="dxa" w:w="60"/>
-              <w:right w:type="dxa" w:w="100"/>
-            </w:tcMar>
-          </w:tcPr>
-          <w:p>
-            <w:r>
-              <w:rPr>
-                <w:rFonts w:ascii="Arial" w:cs="Arial" w:eastAsia="Arial" w:hAnsi="Arial"/>
-                <w:b w:val="false"/>
-                <w:bCs w:val="false"/>
-                <w:i w:val="false"/>
-                <w:iCs w:val="false"/>
-                <w:sz w:val="20"/>
-                <w:szCs w:val="20"/>
-              </w:rPr>
-              <w:t xml:space="preserve">Dropdown</w:t>
-            </w:r>
-          </w:p>
-        </w:tc>
-        <w:tc>
-          <w:tcPr>
-            <w:tcW w:type="dxa" w:w="800"/>
-            <w:tcBorders>
-              <w:top w:val="single" w:color="AAAAAA" w:sz="1"/>
-              <w:left w:val="single" w:color="AAAAAA" w:sz="1"/>
-              <w:bottom w:val="single" w:color="AAAAAA" w:sz="1"/>
-              <w:right w:val="single" w:color="AAAAAA" w:sz="1"/>
-            </w:tcBorders>
-            <w:tcMar>
-              <w:top w:type="dxa" w:w="60"/>
-              <w:left w:type="dxa" w:w="100"/>
-              <w:bottom w:type="dxa" w:w="60"/>
-              <w:right w:type="dxa" w:w="100"/>
-            </w:tcMar>
-          </w:tcPr>
-          <w:p>
-            <w:r>
-              <w:rPr>
-                <w:rFonts w:ascii="Arial" w:cs="Arial" w:eastAsia="Arial" w:hAnsi="Arial"/>
-                <w:b w:val="false"/>
-                <w:bCs w:val="false"/>
-                <w:i w:val="false"/>
-                <w:iCs w:val="false"/>
-                <w:sz w:val="20"/>
-                <w:szCs w:val="20"/>
-              </w:rPr>
-              <w:t xml:space="preserve">Yes</w:t>
-            </w:r>
-          </w:p>
-        </w:tc>
-        <w:tc>
-          <w:tcPr>
-            <w:tcW w:type="dxa" w:w="2400"/>
-            <w:tcBorders>
-              <w:top w:val="single" w:color="AAAAAA" w:sz="1"/>
-              <w:left w:val="single" w:color="AAAAAA" w:sz="1"/>
-              <w:bottom w:val="single" w:color="AAAAAA" w:sz="1"/>
-              <w:right w:val="single" w:color="AAAAAA" w:sz="1"/>
-            </w:tcBorders>
-            <w:tcMar>
-              <w:top w:type="dxa" w:w="60"/>
-              <w:left w:type="dxa" w:w="100"/>
-              <w:bottom w:type="dxa" w:w="60"/>
-              <w:right w:type="dxa" w:w="100"/>
-            </w:tcMar>
-          </w:tcPr>
-          <w:p>
-            <w:r>
-              <w:rPr>
-                <w:rFonts w:ascii="Arial" w:cs="Arial" w:eastAsia="Arial" w:hAnsi="Arial"/>
-                <w:b w:val="false"/>
-                <w:bCs w:val="false"/>
-                <w:i w:val="false"/>
-                <w:iCs w:val="false"/>
-                <w:sz w:val="20"/>
-                <w:szCs w:val="20"/>
-              </w:rPr>
-              <w:t xml:space="preserve">Submitted, Declined, Pending Acceptance, Assigned, Active, On-Hold, Dormant, Inactive, Abandoned, Completed</w:t>
-            </w:r>
-          </w:p>
-        </w:tc>
-        <w:tc>
-          <w:tcPr>
-            <w:tcW w:type="dxa" w:w="1000"/>
-            <w:tcBorders>
-              <w:top w:val="single" w:color="AAAAAA" w:sz="1"/>
-              <w:left w:val="single" w:color="AAAAAA" w:sz="1"/>
-              <w:bottom w:val="single" w:color="AAAAAA" w:sz="1"/>
-              <w:right w:val="single" w:color="AAAAAA" w:sz="1"/>
-            </w:tcBorders>
-            <w:tcMar>
-              <w:top w:type="dxa" w:w="60"/>
-              <w:left w:type="dxa" w:w="100"/>
-              <w:bottom w:type="dxa" w:w="60"/>
-              <w:right w:type="dxa" w:w="100"/>
-            </w:tcMar>
-          </w:tcPr>
-          <w:p>
-            <w:r>
-              <w:rPr>
-                <w:rFonts w:ascii="Arial" w:cs="Arial" w:eastAsia="Arial" w:hAnsi="Arial"/>
-                <w:b w:val="false"/>
-                <w:bCs w:val="false"/>
-                <w:i w:val="false"/>
-                <w:iCs w:val="false"/>
-                <w:sz w:val="20"/>
-                <w:szCs w:val="20"/>
-              </w:rPr>
-              <w:t xml:space="preserve">—</w:t>
-            </w:r>
-          </w:p>
-        </w:tc>
-        <w:tc>
-          <w:tcPr>
-            <w:tcW w:type="dxa" w:w="1860"/>
-            <w:tcBorders>
-              <w:top w:val="single" w:color="AAAAAA" w:sz="1"/>
-              <w:left w:val="single" w:color="AAAAAA" w:sz="1"/>
-              <w:bottom w:val="single" w:color="AAAAAA" w:sz="1"/>
-              <w:right w:val="single" w:color="AAAAAA" w:sz="1"/>
-            </w:tcBorders>
-            <w:tcMar>
-              <w:top w:type="dxa" w:w="60"/>
-              <w:left w:type="dxa" w:w="100"/>
-              <w:bottom w:type="dxa" w:w="60"/>
-              <w:right w:type="dxa" w:w="100"/>
-            </w:tcMar>
-          </w:tcPr>
-          <w:p>
-            <w:r>
-              <w:rPr>
-                <w:rFonts w:ascii="Arial" w:cs="Arial" w:eastAsia="Arial" w:hAnsi="Arial"/>
-                <w:b w:val="false"/>
-                <w:bCs w:val="false"/>
-                <w:i w:val="false"/>
-                <w:iCs w:val="false"/>
-                <w:color w:val="888888"/>
-                <w:sz w:val="16"/>
-                <w:szCs w:val="16"/>
-              </w:rPr>
-              <w:t xml:space="preserve">MN-MATCH-DAT-023</w:t>
-            </w:r>
-          </w:p>
-        </w:tc>
-      </w:tr>
-      <w:tr>
-        <w:tc>
-          <w:tcPr>
-            <w:tcW w:type="dxa" w:w="9360"/>
-            <w:gridSpan w:val="6"/>
-            <w:tcBorders>
-              <w:top w:val="single" w:color="AAAAAA" w:sz="1"/>
-              <w:left w:val="single" w:color="AAAAAA" w:sz="1"/>
-              <w:bottom w:val="single" w:color="AAAAAA" w:sz="1"/>
-              <w:right w:val="single" w:color="AAAAAA" w:sz="1"/>
-            </w:tcBorders>
-            <w:tcMar>
-              <w:top w:type="dxa" w:w="40"/>
-              <w:left w:type="dxa" w:w="100"/>
-              <w:bottom w:type="dxa" w:w="80"/>
-              <w:right w:type="dxa" w:w="100"/>
-            </w:tcMar>
-          </w:tcPr>
-          <w:p>
-            <w:r>
-              <w:rPr>
-                <w:rFonts w:ascii="Arial" w:cs="Arial" w:eastAsia="Arial" w:hAnsi="Arial"/>
-                <w:b w:val="false"/>
-                <w:bCs w:val="false"/>
-                <w:i w:val="false"/>
-                <w:iCs w:val="false"/>
-                <w:color w:val="888888"/>
-                <w:sz w:val="20"/>
-                <w:szCs w:val="20"/>
-              </w:rPr>
-              <w:t xml:space="preserve">Updated by this process: transitions from Submitted to Pending Acceptance when a mentor is nominated, to Assigned when the mentor accepts, or back to Submitted if the mentor declines.</w:t>
-            </w:r>
-          </w:p>
-        </w:tc>
-      </w:tr>
-      <w:tr>
-        <w:tc>
-          <w:tcPr>
-            <w:tcW w:type="dxa" w:w="2200"/>
-            <w:tcBorders>
-              <w:top w:val="single" w:color="AAAAAA" w:sz="1"/>
-              <w:left w:val="single" w:color="AAAAAA" w:sz="1"/>
-              <w:bottom w:val="single" w:color="AAAAAA" w:sz="1"/>
-              <w:right w:val="single" w:color="AAAAAA" w:sz="1"/>
-            </w:tcBorders>
-            <w:shd w:fill="F2F7FB" w:val="clear"/>
-            <w:tcMar>
-              <w:top w:type="dxa" w:w="60"/>
-              <w:left w:type="dxa" w:w="100"/>
-              <w:bottom w:type="dxa" w:w="60"/>
-              <w:right w:type="dxa" w:w="100"/>
-            </w:tcMar>
-          </w:tcPr>
-          <w:p>
-            <w:r>
-              <w:rPr>
-                <w:rFonts w:ascii="Arial" w:cs="Arial" w:eastAsia="Arial" w:hAnsi="Arial"/>
-                <w:b/>
-                <w:bCs/>
-                <w:i w:val="false"/>
-                <w:iCs w:val="false"/>
-                <w:sz w:val="20"/>
-                <w:szCs w:val="20"/>
-              </w:rPr>
-              <w:t xml:space="preserve">Engagement Contacts</w:t>
-            </w:r>
-          </w:p>
-        </w:tc>
-        <w:tc>
-          <w:tcPr>
-            <w:tcW w:type="dxa" w:w="1100"/>
-            <w:tcBorders>
-              <w:top w:val="single" w:color="AAAAAA" w:sz="1"/>
-              <w:left w:val="single" w:color="AAAAAA" w:sz="1"/>
-              <w:bottom w:val="single" w:color="AAAAAA" w:sz="1"/>
-              <w:right w:val="single" w:color="AAAAAA" w:sz="1"/>
-            </w:tcBorders>
-            <w:shd w:fill="F2F7FB" w:val="clear"/>
-            <w:tcMar>
-              <w:top w:type="dxa" w:w="60"/>
-              <w:left w:type="dxa" w:w="100"/>
-              <w:bottom w:type="dxa" w:w="60"/>
-              <w:right w:type="dxa" w:w="100"/>
-            </w:tcMar>
-          </w:tcPr>
-          <w:p>
-            <w:r>
-              <w:rPr>
-                <w:rFonts w:ascii="Arial" w:cs="Arial" w:eastAsia="Arial" w:hAnsi="Arial"/>
-                <w:b w:val="false"/>
-                <w:bCs w:val="false"/>
-                <w:i w:val="false"/>
-                <w:iCs w:val="false"/>
-                <w:sz w:val="20"/>
-                <w:szCs w:val="20"/>
-              </w:rPr>
-              <w:t xml:space="preserve">Relationship (many)</w:t>
-            </w:r>
-          </w:p>
-        </w:tc>
-        <w:tc>
-          <w:tcPr>
-            <w:tcW w:type="dxa" w:w="800"/>
-            <w:tcBorders>
-              <w:top w:val="single" w:color="AAAAAA" w:sz="1"/>
-              <w:left w:val="single" w:color="AAAAAA" w:sz="1"/>
-              <w:bottom w:val="single" w:color="AAAAAA" w:sz="1"/>
-              <w:right w:val="single" w:color="AAAAAA" w:sz="1"/>
-            </w:tcBorders>
-            <w:shd w:fill="F2F7FB" w:val="clear"/>
-            <w:tcMar>
-              <w:top w:type="dxa" w:w="60"/>
-              <w:left w:type="dxa" w:w="100"/>
-              <w:bottom w:type="dxa" w:w="60"/>
-              <w:right w:type="dxa" w:w="100"/>
-            </w:tcMar>
-          </w:tcPr>
-          <w:p>
-            <w:r>
-              <w:rPr>
-                <w:rFonts w:ascii="Arial" w:cs="Arial" w:eastAsia="Arial" w:hAnsi="Arial"/>
-                <w:b w:val="false"/>
-                <w:bCs w:val="false"/>
-                <w:i w:val="false"/>
-                <w:iCs w:val="false"/>
-                <w:sz w:val="20"/>
-                <w:szCs w:val="20"/>
-              </w:rPr>
-              <w:t xml:space="preserve">No</w:t>
-            </w:r>
-          </w:p>
-        </w:tc>
-        <w:tc>
-          <w:tcPr>
-            <w:tcW w:type="dxa" w:w="2400"/>
-            <w:tcBorders>
-              <w:top w:val="single" w:color="AAAAAA" w:sz="1"/>
-              <w:left w:val="single" w:color="AAAAAA" w:sz="1"/>
-              <w:bottom w:val="single" w:color="AAAAAA" w:sz="1"/>
-              <w:right w:val="single" w:color="AAAAAA" w:sz="1"/>
-            </w:tcBorders>
-            <w:shd w:fill="F2F7FB" w:val="clear"/>
-            <w:tcMar>
-              <w:top w:type="dxa" w:w="60"/>
-              <w:left w:type="dxa" w:w="100"/>
-              <w:bottom w:type="dxa" w:w="60"/>
-              <w:right w:type="dxa" w:w="100"/>
-            </w:tcMar>
-          </w:tcPr>
-          <w:p>
-            <w:r>
-              <w:rPr>
-                <w:rFonts w:ascii="Arial" w:cs="Arial" w:eastAsia="Arial" w:hAnsi="Arial"/>
-                <w:b w:val="false"/>
-                <w:bCs w:val="false"/>
-                <w:i w:val="false"/>
-                <w:iCs w:val="false"/>
-                <w:sz w:val="20"/>
-                <w:szCs w:val="20"/>
-              </w:rPr>
-              <w:t xml:space="preserve">—</w:t>
-            </w:r>
-          </w:p>
-        </w:tc>
-        <w:tc>
-          <w:tcPr>
-            <w:tcW w:type="dxa" w:w="1000"/>
-            <w:tcBorders>
-              <w:top w:val="single" w:color="AAAAAA" w:sz="1"/>
-              <w:left w:val="single" w:color="AAAAAA" w:sz="1"/>
-              <w:bottom w:val="single" w:color="AAAAAA" w:sz="1"/>
-              <w:right w:val="single" w:color="AAAAAA" w:sz="1"/>
-            </w:tcBorders>
-            <w:shd w:fill="F2F7FB" w:val="clear"/>
-            <w:tcMar>
-              <w:top w:type="dxa" w:w="60"/>
-              <w:left w:type="dxa" w:w="100"/>
-              <w:bottom w:type="dxa" w:w="60"/>
-              <w:right w:type="dxa" w:w="100"/>
-            </w:tcMar>
-          </w:tcPr>
-          <w:p>
-            <w:r>
-              <w:rPr>
-                <w:rFonts w:ascii="Arial" w:cs="Arial" w:eastAsia="Arial" w:hAnsi="Arial"/>
-                <w:b w:val="false"/>
-                <w:bCs w:val="false"/>
-                <w:i w:val="false"/>
-                <w:iCs w:val="false"/>
-                <w:sz w:val="20"/>
-                <w:szCs w:val="20"/>
-              </w:rPr>
-              <w:t xml:space="preserve">—</w:t>
-            </w:r>
-          </w:p>
-        </w:tc>
-        <w:tc>
-          <w:tcPr>
-            <w:tcW w:type="dxa" w:w="1860"/>
-            <w:tcBorders>
-              <w:top w:val="single" w:color="AAAAAA" w:sz="1"/>
-              <w:left w:val="single" w:color="AAAAAA" w:sz="1"/>
-              <w:bottom w:val="single" w:color="AAAAAA" w:sz="1"/>
-              <w:right w:val="single" w:color="AAAAAA" w:sz="1"/>
-            </w:tcBorders>
-            <w:shd w:fill="F2F7FB" w:val="clear"/>
-            <w:tcMar>
-              <w:top w:type="dxa" w:w="60"/>
-              <w:left w:type="dxa" w:w="100"/>
-              <w:bottom w:type="dxa" w:w="60"/>
-              <w:right w:type="dxa" w:w="100"/>
-            </w:tcMar>
-          </w:tcPr>
-          <w:p>
-            <w:r>
-              <w:rPr>
-                <w:rFonts w:ascii="Arial" w:cs="Arial" w:eastAsia="Arial" w:hAnsi="Arial"/>
-                <w:b w:val="false"/>
-                <w:bCs w:val="false"/>
-                <w:i w:val="false"/>
-                <w:iCs w:val="false"/>
-                <w:color w:val="888888"/>
-                <w:sz w:val="16"/>
-                <w:szCs w:val="16"/>
-              </w:rPr>
-              <w:t xml:space="preserve">MN-MATCH-DAT-024</w:t>
-            </w:r>
-          </w:p>
-        </w:tc>
-      </w:tr>
-      <w:tr>
-        <w:tc>
-          <w:tcPr>
-            <w:tcW w:type="dxa" w:w="9360"/>
-            <w:gridSpan w:val="6"/>
-            <w:tcBorders>
-              <w:top w:val="single" w:color="AAAAAA" w:sz="1"/>
-              <w:left w:val="single" w:color="AAAAAA" w:sz="1"/>
-              <w:bottom w:val="single" w:color="AAAAAA" w:sz="1"/>
-              <w:right w:val="single" w:color="AAAAAA" w:sz="1"/>
-            </w:tcBorders>
-            <w:shd w:fill="F2F7FB" w:val="clear"/>
             <w:tcMar>
               <w:top w:type="dxa" w:w="40"/>
               <w:left w:type="dxa" w:w="100"/>

</xml_diff>

<commit_message>
Update MN-MATCH: add departure-driven reassignment trigger
Second entry point added per MR-DEPART Update 2. Mentor Administrator
contacts Client Assignment Coordinator to initiate reassignment of
active engagements from a departing mentor.
</commit_message>
<xml_diff>
--- a/PRDs/MN/MN-MATCH.docx
+++ b/PRDs/MN/MN-MATCH.docx
@@ -394,7 +394,7 @@
                 <w:sz w:val="20"/>
                 <w:szCs w:val="20"/>
               </w:rPr>
-              <w:t xml:space="preserve">04-01-26 05:00</w:t>
+              <w:t xml:space="preserve">04-05-26 22:00</w:t>
             </w:r>
           </w:p>
         </w:tc>
@@ -622,7 +622,7 @@
           <w:sz w:val="22"/>
           <w:szCs w:val="22"/>
         </w:rPr>
-        <w:t xml:space="preserve">Manual. The Client Assignment Coordinator reviews the approved submission and begins the matching process. There is no automatic trigger — the coordinator decides when to begin matching for each approved application.</w:t>
+        <w:t xml:space="preserve">Manual. This process has two entry points. The primary entry point is when the Client Assignment Coordinator reviews an approved client submission and begins the matching process. There is no automatic trigger — the coordinator decides when to begin matching for each approved application. The second entry point is when the Mentor Administrator contacts the Client Assignment Coordinator to initiate reassignment of active engagements from a departing mentor (triggered by MR-DEPART). In this case, the Engagement record already exists at an active status and the matching process focuses on finding a replacement mentor rather than an initial assignment.</w:t>
       </w:r>
     </w:p>
     <w:p>

</xml_diff>

<commit_message>
MN-MATCH v2.2: Add Requested Mentor preference workflow
- Added workflow step 2: check Requested Mentor before roster search (9 steps)
- Added MN-MATCH-REQ-009: review Requested Mentor preference when present
- Added MN-MATCH-DAT-024: Requested Mentor in Process Data Engagement table
- Added V2.2 interview transcript entry
- Triggered by MN-INTAKE v2.2 Section 10 (MN-INTAKE-DAT-026)
</commit_message>
<xml_diff>
--- a/PRDs/MN/MN-MATCH.docx
+++ b/PRDs/MN/MN-MATCH.docx
@@ -264,7 +264,7 @@
                 <w:sz w:val="20"/>
                 <w:szCs w:val="20"/>
               </w:rPr>
-              <w:t xml:space="preserve">2.1</w:t>
+              <w:t xml:space="preserve">2.2</w:t>
             </w:r>
           </w:p>
         </w:tc>
@@ -394,7 +394,7 @@
                 <w:sz w:val="20"/>
                 <w:szCs w:val="20"/>
               </w:rPr>
-              <w:t xml:space="preserve">04-05-26 22:00</w:t>
+              <w:t xml:space="preserve">04-05-26 18:30</w:t>
             </w:r>
           </w:p>
         </w:tc>
@@ -459,7 +459,7 @@
                 <w:sz w:val="20"/>
                 <w:szCs w:val="20"/>
               </w:rPr>
-              <w:t xml:space="preserve">Reworked from MN-MATCH v1.0; originally extracted from CBM-Domain-PRD-Mentoring.md v1.0</w:t>
+              <w:t xml:space="preserve">Reworked from MN-MATCH v2.1; originally extracted from CBM-Domain-PRD-Mentoring.md v1.0</w:t>
             </w:r>
           </w:p>
         </w:tc>
@@ -838,6 +838,28 @@
           <w:sz w:val="22"/>
           <w:szCs w:val="22"/>
         </w:rPr>
+        <w:t xml:space="preserve">The Client Assignment Coordinator checks whether the Engagement has a Requested Mentor (MN-INTAKE-DAT-026). If the client selected a preferred mentor during intake, the coordinator reviews the requested mentor’s profile, availability, and fit. If the requested mentor is appropriate and available, the coordinator may proceed directly to nomination (step 4). If the requested mentor is not appropriate or not available, the coordinator proceeds to the general roster search in the next step.</w:t>
+      </w:r>
+    </w:p>
+    <w:p>
+      <w:pPr>
+        <w:pStyle w:val="ListParagraph"/>
+        <w:numPr>
+          <w:ilvl w:val="0"/>
+          <w:numId w:val="2"/>
+        </w:numPr>
+        <w:spacing w:after="80"/>
+      </w:pPr>
+      <w:r>
+        <w:rPr>
+          <w:rFonts w:ascii="Arial" w:cs="Arial" w:eastAsia="Arial" w:hAnsi="Arial"/>
+          <w:b w:val="false"/>
+          <w:bCs w:val="false"/>
+          <w:i w:val="false"/>
+          <w:iCs w:val="false"/>
+          <w:sz w:val="22"/>
+          <w:szCs w:val="22"/>
+        </w:rPr>
         <w:t xml:space="preserve">The Client Assignment Coordinator searches the active mentor roster. The system provides a list filter that shows only mentors who are Active, currently accepting new clients, and have available capacity. The coordinator filters and evaluates candidates against client needs, considering industry expertise, mentoring focus areas, skills and expertise tags, and language where relevant. The coordinator is not prevented from assigning a mentor who does not meet the filter criteria if they have discussed the assignment with the mentor directly.</w:t>
       </w:r>
     </w:p>
@@ -1870,6 +1892,70 @@
           </w:p>
         </w:tc>
       </w:tr>
+      <w:tr>
+        <w:tc>
+          <w:tcPr>
+            <w:tcW w:type="dxa" w:w="2000"/>
+            <w:tcBorders>
+              <w:top w:val="single" w:color="AAAAAA" w:sz="1"/>
+              <w:left w:val="single" w:color="AAAAAA" w:sz="1"/>
+              <w:bottom w:val="single" w:color="AAAAAA" w:sz="1"/>
+              <w:right w:val="single" w:color="AAAAAA" w:sz="1"/>
+            </w:tcBorders>
+            <w:tcMar>
+              <w:top w:type="dxa" w:w="60"/>
+              <w:left w:type="dxa" w:w="100"/>
+              <w:bottom w:type="dxa" w:w="60"/>
+              <w:right w:type="dxa" w:w="100"/>
+            </w:tcMar>
+          </w:tcPr>
+          <w:p>
+            <w:r>
+              <w:rPr>
+                <w:rFonts w:ascii="Arial" w:cs="Arial" w:eastAsia="Arial" w:hAnsi="Arial"/>
+                <w:b/>
+                <w:bCs/>
+                <w:i w:val="false"/>
+                <w:iCs w:val="false"/>
+                <w:sz w:val="20"/>
+                <w:szCs w:val="20"/>
+              </w:rPr>
+              <w:t xml:space="preserve">MN-MATCH-REQ-009</w:t>
+            </w:r>
+          </w:p>
+        </w:tc>
+        <w:tc>
+          <w:tcPr>
+            <w:tcW w:type="dxa" w:w="7360"/>
+            <w:tcBorders>
+              <w:top w:val="single" w:color="AAAAAA" w:sz="1"/>
+              <w:left w:val="single" w:color="AAAAAA" w:sz="1"/>
+              <w:bottom w:val="single" w:color="AAAAAA" w:sz="1"/>
+              <w:right w:val="single" w:color="AAAAAA" w:sz="1"/>
+            </w:tcBorders>
+            <w:tcMar>
+              <w:top w:type="dxa" w:w="60"/>
+              <w:left w:type="dxa" w:w="100"/>
+              <w:bottom w:type="dxa" w:w="60"/>
+              <w:right w:type="dxa" w:w="100"/>
+            </w:tcMar>
+          </w:tcPr>
+          <w:p>
+            <w:r>
+              <w:rPr>
+                <w:rFonts w:ascii="Arial" w:cs="Arial" w:eastAsia="Arial" w:hAnsi="Arial"/>
+                <w:b w:val="false"/>
+                <w:bCs w:val="false"/>
+                <w:i w:val="false"/>
+                <w:iCs w:val="false"/>
+                <w:sz w:val="20"/>
+                <w:szCs w:val="20"/>
+              </w:rPr>
+              <w:t xml:space="preserve">When a Requested Mentor is present on the Engagement, the Client Assignment Coordinator must review the requested mentor’s profile, availability, and fit before searching the general mentor roster. The request is a client preference, not a binding assignment.</w:t>
+            </w:r>
+          </w:p>
+        </w:tc>
+      </w:tr>
     </w:tbl>
     <w:p>
       <w:pPr>
@@ -4895,6 +4981,230 @@
                 <w:szCs w:val="20"/>
               </w:rPr>
               <w:t xml:space="preserve">Identifies the single client contact who is the primary point of contact for this specific engagement. Included in the client summary sent to the nominated mentor alongside business details and mentoring needs.</w:t>
+            </w:r>
+          </w:p>
+        </w:tc>
+      </w:tr>
+      <w:tr>
+        <w:tc>
+          <w:tcPr>
+            <w:tcW w:type="dxa" w:w="2200"/>
+            <w:tcBorders>
+              <w:top w:val="single" w:color="AAAAAA" w:sz="1"/>
+              <w:left w:val="single" w:color="AAAAAA" w:sz="1"/>
+              <w:bottom w:val="single" w:color="AAAAAA" w:sz="1"/>
+              <w:right w:val="single" w:color="AAAAAA" w:sz="1"/>
+            </w:tcBorders>
+            <w:tcMar>
+              <w:top w:type="dxa" w:w="60"/>
+              <w:left w:type="dxa" w:w="100"/>
+              <w:bottom w:type="dxa" w:w="60"/>
+              <w:right w:type="dxa" w:w="100"/>
+            </w:tcMar>
+          </w:tcPr>
+          <w:p>
+            <w:r>
+              <w:rPr>
+                <w:rFonts w:ascii="Arial" w:cs="Arial" w:eastAsia="Arial" w:hAnsi="Arial"/>
+                <w:b/>
+                <w:bCs/>
+                <w:i w:val="false"/>
+                <w:iCs w:val="false"/>
+                <w:sz w:val="20"/>
+                <w:szCs w:val="20"/>
+              </w:rPr>
+              <w:t xml:space="preserve">Requested Mentor</w:t>
+            </w:r>
+          </w:p>
+        </w:tc>
+        <w:tc>
+          <w:tcPr>
+            <w:tcW w:type="dxa" w:w="1100"/>
+            <w:tcBorders>
+              <w:top w:val="single" w:color="AAAAAA" w:sz="1"/>
+              <w:left w:val="single" w:color="AAAAAA" w:sz="1"/>
+              <w:bottom w:val="single" w:color="AAAAAA" w:sz="1"/>
+              <w:right w:val="single" w:color="AAAAAA" w:sz="1"/>
+            </w:tcBorders>
+            <w:tcMar>
+              <w:top w:type="dxa" w:w="60"/>
+              <w:left w:type="dxa" w:w="100"/>
+              <w:bottom w:type="dxa" w:w="60"/>
+              <w:right w:type="dxa" w:w="100"/>
+            </w:tcMar>
+          </w:tcPr>
+          <w:p>
+            <w:r>
+              <w:rPr>
+                <w:rFonts w:ascii="Arial" w:cs="Arial" w:eastAsia="Arial" w:hAnsi="Arial"/>
+                <w:b w:val="false"/>
+                <w:bCs w:val="false"/>
+                <w:i w:val="false"/>
+                <w:iCs w:val="false"/>
+                <w:sz w:val="20"/>
+                <w:szCs w:val="20"/>
+              </w:rPr>
+              <w:t xml:space="preserve">relationship</w:t>
+            </w:r>
+          </w:p>
+        </w:tc>
+        <w:tc>
+          <w:tcPr>
+            <w:tcW w:type="dxa" w:w="800"/>
+            <w:tcBorders>
+              <w:top w:val="single" w:color="AAAAAA" w:sz="1"/>
+              <w:left w:val="single" w:color="AAAAAA" w:sz="1"/>
+              <w:bottom w:val="single" w:color="AAAAAA" w:sz="1"/>
+              <w:right w:val="single" w:color="AAAAAA" w:sz="1"/>
+            </w:tcBorders>
+            <w:tcMar>
+              <w:top w:type="dxa" w:w="60"/>
+              <w:left w:type="dxa" w:w="100"/>
+              <w:bottom w:type="dxa" w:w="60"/>
+              <w:right w:type="dxa" w:w="100"/>
+            </w:tcMar>
+          </w:tcPr>
+          <w:p>
+            <w:r>
+              <w:rPr>
+                <w:rFonts w:ascii="Arial" w:cs="Arial" w:eastAsia="Arial" w:hAnsi="Arial"/>
+                <w:b w:val="false"/>
+                <w:bCs w:val="false"/>
+                <w:i w:val="false"/>
+                <w:iCs w:val="false"/>
+                <w:sz w:val="20"/>
+                <w:szCs w:val="20"/>
+              </w:rPr>
+              <w:t xml:space="preserve">No</w:t>
+            </w:r>
+          </w:p>
+        </w:tc>
+        <w:tc>
+          <w:tcPr>
+            <w:tcW w:type="dxa" w:w="2400"/>
+            <w:tcBorders>
+              <w:top w:val="single" w:color="AAAAAA" w:sz="1"/>
+              <w:left w:val="single" w:color="AAAAAA" w:sz="1"/>
+              <w:bottom w:val="single" w:color="AAAAAA" w:sz="1"/>
+              <w:right w:val="single" w:color="AAAAAA" w:sz="1"/>
+            </w:tcBorders>
+            <w:tcMar>
+              <w:top w:type="dxa" w:w="60"/>
+              <w:left w:type="dxa" w:w="100"/>
+              <w:bottom w:type="dxa" w:w="60"/>
+              <w:right w:type="dxa" w:w="100"/>
+            </w:tcMar>
+          </w:tcPr>
+          <w:p>
+            <w:r>
+              <w:rPr>
+                <w:rFonts w:ascii="Arial" w:cs="Arial" w:eastAsia="Arial" w:hAnsi="Arial"/>
+                <w:b w:val="false"/>
+                <w:bCs w:val="false"/>
+                <w:i w:val="false"/>
+                <w:iCs w:val="false"/>
+                <w:sz w:val="20"/>
+                <w:szCs w:val="20"/>
+              </w:rPr>
+              <w:t xml:space="preserve">—</w:t>
+            </w:r>
+          </w:p>
+        </w:tc>
+        <w:tc>
+          <w:tcPr>
+            <w:tcW w:type="dxa" w:w="1000"/>
+            <w:tcBorders>
+              <w:top w:val="single" w:color="AAAAAA" w:sz="1"/>
+              <w:left w:val="single" w:color="AAAAAA" w:sz="1"/>
+              <w:bottom w:val="single" w:color="AAAAAA" w:sz="1"/>
+              <w:right w:val="single" w:color="AAAAAA" w:sz="1"/>
+            </w:tcBorders>
+            <w:tcMar>
+              <w:top w:type="dxa" w:w="60"/>
+              <w:left w:type="dxa" w:w="100"/>
+              <w:bottom w:type="dxa" w:w="60"/>
+              <w:right w:type="dxa" w:w="100"/>
+            </w:tcMar>
+          </w:tcPr>
+          <w:p>
+            <w:r>
+              <w:rPr>
+                <w:rFonts w:ascii="Arial" w:cs="Arial" w:eastAsia="Arial" w:hAnsi="Arial"/>
+                <w:b w:val="false"/>
+                <w:bCs w:val="false"/>
+                <w:i w:val="false"/>
+                <w:iCs w:val="false"/>
+                <w:sz w:val="20"/>
+                <w:szCs w:val="20"/>
+              </w:rPr>
+              <w:t xml:space="preserve">—</w:t>
+            </w:r>
+          </w:p>
+        </w:tc>
+        <w:tc>
+          <w:tcPr>
+            <w:tcW w:type="dxa" w:w="1860"/>
+            <w:tcBorders>
+              <w:top w:val="single" w:color="AAAAAA" w:sz="1"/>
+              <w:left w:val="single" w:color="AAAAAA" w:sz="1"/>
+              <w:bottom w:val="single" w:color="AAAAAA" w:sz="1"/>
+              <w:right w:val="single" w:color="AAAAAA" w:sz="1"/>
+            </w:tcBorders>
+            <w:tcMar>
+              <w:top w:type="dxa" w:w="60"/>
+              <w:left w:type="dxa" w:w="100"/>
+              <w:bottom w:type="dxa" w:w="60"/>
+              <w:right w:type="dxa" w:w="100"/>
+            </w:tcMar>
+          </w:tcPr>
+          <w:p>
+            <w:r>
+              <w:rPr>
+                <w:rFonts w:ascii="Arial" w:cs="Arial" w:eastAsia="Arial" w:hAnsi="Arial"/>
+                <w:b w:val="false"/>
+                <w:bCs w:val="false"/>
+                <w:i w:val="false"/>
+                <w:iCs w:val="false"/>
+                <w:color w:val="888888"/>
+                <w:sz w:val="16"/>
+                <w:szCs w:val="16"/>
+              </w:rPr>
+              <w:t xml:space="preserve">MN-MATCH-DAT-024</w:t>
+            </w:r>
+          </w:p>
+        </w:tc>
+      </w:tr>
+      <w:tr>
+        <w:tc>
+          <w:tcPr>
+            <w:tcW w:type="dxa" w:w="9360"/>
+            <w:gridSpan w:val="6"/>
+            <w:tcBorders>
+              <w:top w:val="single" w:color="AAAAAA" w:sz="1"/>
+              <w:left w:val="single" w:color="AAAAAA" w:sz="1"/>
+              <w:bottom w:val="single" w:color="AAAAAA" w:sz="1"/>
+              <w:right w:val="single" w:color="AAAAAA" w:sz="1"/>
+            </w:tcBorders>
+            <w:tcMar>
+              <w:top w:type="dxa" w:w="40"/>
+              <w:left w:type="dxa" w:w="100"/>
+              <w:bottom w:type="dxa" w:w="80"/>
+              <w:right w:type="dxa" w:w="100"/>
+            </w:tcMar>
+          </w:tcPr>
+          <w:p>
+            <w:r>
+              <w:rPr>
+                <w:rFonts w:ascii="Arial" w:cs="Arial" w:eastAsia="Arial" w:hAnsi="Arial"/>
+                <w:b w:val="false"/>
+                <w:bCs w:val="false"/>
+                <w:i w:val="false"/>
+                <w:iCs w:val="false"/>
+                <w:color w:val="888888"/>
+                <w:sz w:val="20"/>
+                <w:szCs w:val="20"/>
+              </w:rPr>
+              <w:t xml:space="preserve">Links to a Mentor Contact record optionally selected by the client during the intake form submission (MN-INTAKE-DAT-026). When present, the Client Assignment Coordinator reviews this preference before searching the general mentor roster. This is a client preference, not a binding assignment.</w:t>
             </w:r>
           </w:p>
         </w:tc>
@@ -8545,6 +8855,74 @@
           <w:szCs w:val="22"/>
         </w:rPr>
         <w:t xml:space="preserve">This version restructures the document from the original six-section format to the v2.4 eleven-section format. New sections (Process Triggers, Process Completion, Open Issues, Updates to Prior Documents, Interview Transcript) were added. Field type names were updated to use the authoritative type list (e.g., Text → varchar, Dropdown → enum, Multi-select → multiEnum, Integer → int, Yes/No → bool, Relationship preserved as relationship). The TBD reference for Mentoring Focus Areas was updated from MN-ISS-001 to MN-INTAKE-ISS-001 to use the proper namespaced identifier. The workflow was revised from 11 steps to 8, replacing the system verification step with a list filter and merging the nomination, status transition, and notification into a single step. REQ-002 and REQ-003 were updated accordingly.</w:t>
+      </w:r>
+    </w:p>
+    <w:p>
+      <w:pPr>
+        <w:spacing w:after="40"/>
+      </w:pPr>
+      <w:r>
+        <w:rPr>
+          <w:rFonts w:ascii="Arial" w:cs="Arial" w:eastAsia="Arial" w:hAnsi="Arial"/>
+          <w:b/>
+          <w:bCs/>
+          <w:i w:val="false"/>
+          <w:iCs w:val="false"/>
+          <w:sz w:val="22"/>
+          <w:szCs w:val="22"/>
+        </w:rPr>
+        <w:t xml:space="preserve">V2.2 Requested Mentor Preference</w:t>
+      </w:r>
+    </w:p>
+    <w:p>
+      <w:pPr>
+        <w:spacing w:after="40"/>
+      </w:pPr>
+      <w:r>
+        <w:rPr>
+          <w:rFonts w:ascii="Arial" w:cs="Arial" w:eastAsia="Arial" w:hAnsi="Arial"/>
+          <w:b w:val="false"/>
+          <w:bCs w:val="false"/>
+          <w:i/>
+          <w:iCs/>
+          <w:sz w:val="22"/>
+          <w:szCs w:val="22"/>
+        </w:rPr>
+        <w:t xml:space="preserve">Q: MN-INTAKE v2.2 added a Requested Mentor field (MN-INTAKE-DAT-026) allowing clients to optionally select a preferred mentor during intake. How should this affect the Mentor Matching process?</w:t>
+      </w:r>
+    </w:p>
+    <w:p>
+      <w:pPr>
+        <w:spacing w:after="40"/>
+      </w:pPr>
+      <w:r>
+        <w:rPr>
+          <w:rFonts w:ascii="Arial" w:cs="Arial" w:eastAsia="Arial" w:hAnsi="Arial"/>
+          <w:b w:val="false"/>
+          <w:bCs w:val="false"/>
+          <w:i w:val="false"/>
+          <w:iCs w:val="false"/>
+          <w:sz w:val="22"/>
+          <w:szCs w:val="22"/>
+        </w:rPr>
+        <w:t xml:space="preserve">A: When a Requested Mentor is present on the Engagement, the Client Assignment Coordinator should review that mentor’s profile, availability, and fit before searching the general roster. If the requested mentor is appropriate and available, the coordinator may proceed directly to nomination. The request is a preference, not a guarantee.</w:t>
+      </w:r>
+    </w:p>
+    <w:p>
+      <w:pPr>
+        <w:spacing w:after="40"/>
+      </w:pPr>
+      <w:r>
+        <w:rPr>
+          <w:rFonts w:ascii="Arial" w:cs="Arial" w:eastAsia="Arial" w:hAnsi="Arial"/>
+          <w:b/>
+          <w:bCs/>
+          <w:i w:val="false"/>
+          <w:iCs w:val="false"/>
+          <w:sz w:val="22"/>
+          <w:szCs w:val="22"/>
+        </w:rPr>
+        <w:t xml:space="preserve">Decision: Added workflow step 2 (Requested Mentor check before roster search). Added MN-MATCH-REQ-009 (review Requested Mentor preference). Added Requested Mentor (MN-MATCH-DAT-024) to Process Data Engagement table. Workflow expanded from 8 steps to 9.</w:t>
       </w:r>
     </w:p>
     <w:sectPr>

</xml_diff>